<commit_message>
Updates to week 2 E26
</commit_message>
<xml_diff>
--- a/02 Strategy/Hospital Bed - GoF Strategy.docx
+++ b/02 Strategy/Hospital Bed - GoF Strategy.docx
@@ -1,6 +1,6 @@
 
 <file path=word/document.xml><?xml version="1.0" encoding="utf-8"?>
-<w:document xmlns:wpc="http://schemas.microsoft.com/office/word/2010/wordprocessingCanvas" xmlns:cx="http://schemas.microsoft.com/office/drawing/2014/chartex" xmlns:cx1="http://schemas.microsoft.com/office/drawing/2015/9/8/chartex" xmlns:cx2="http://schemas.microsoft.com/office/drawing/2015/10/21/chartex" xmlns:cx3="http://schemas.microsoft.com/office/drawing/2016/5/9/chartex" xmlns:cx4="http://schemas.microsoft.com/office/drawing/2016/5/10/chartex" xmlns:cx5="http://schemas.microsoft.com/office/drawing/2016/5/11/chartex" xmlns:cx6="http://schemas.microsoft.com/office/drawing/2016/5/12/chartex" xmlns:cx7="http://schemas.microsoft.com/office/drawing/2016/5/13/chartex" xmlns:cx8="http://schemas.microsoft.com/office/drawing/2016/5/14/chartex" xmlns:mc="http://schemas.openxmlformats.org/markup-compatibility/2006" xmlns:aink="http://schemas.microsoft.com/office/drawing/2016/ink" xmlns:am3d="http://schemas.microsoft.com/office/drawing/2017/model3d" xmlns:o="urn:schemas-microsoft-com:office:office" xmlns:oel="http://schemas.microsoft.com/office/2019/extlst" xmlns:r="http://schemas.openxmlformats.org/officeDocument/2006/relationships" xmlns:m="http://schemas.openxmlformats.org/officeDocument/2006/math" xmlns:v="urn:schemas-microsoft-com:vml" xmlns:wp14="http://schemas.microsoft.com/office/word/2010/wordprocessingDrawing" xmlns:wp="http://schemas.openxmlformats.org/drawingml/2006/wordprocessingDrawing" xmlns:w10="urn:schemas-microsoft-com:office:word" xmlns:w="http://schemas.openxmlformats.org/wordprocessingml/2006/main" xmlns:w14="http://schemas.microsoft.com/office/word/2010/wordml" xmlns:w15="http://schemas.microsoft.com/office/word/2012/wordml" xmlns:w16cex="http://schemas.microsoft.com/office/word/2018/wordml/cex" xmlns:w16cid="http://schemas.microsoft.com/office/word/2016/wordml/cid" xmlns:w16="http://schemas.microsoft.com/office/word/2018/wordml" xmlns:w16du="http://schemas.microsoft.com/office/word/2023/wordml/word16du" xmlns:w16sdtdh="http://schemas.microsoft.com/office/word/2020/wordml/sdtdatahash" xmlns:w16sdtfl="http://schemas.microsoft.com/office/word/2024/wordml/sdtformatlock" xmlns:w16se="http://schemas.microsoft.com/office/word/2015/wordml/symex" xmlns:wpg="http://schemas.microsoft.com/office/word/2010/wordprocessingGroup" xmlns:wpi="http://schemas.microsoft.com/office/word/2010/wordprocessingInk" xmlns:wne="http://schemas.microsoft.com/office/word/2006/wordml" xmlns:wps="http://schemas.microsoft.com/office/word/2010/wordprocessingShape" mc:Ignorable="w14 w15 w16se w16cid w16 w16cex w16sdtdh w16sdtfl w16du wp14">
+<w:document xmlns:wpc="http://schemas.microsoft.com/office/word/2010/wordprocessingCanvas" xmlns:cx="http://schemas.microsoft.com/office/drawing/2014/chartex" xmlns:cx1="http://schemas.microsoft.com/office/drawing/2015/9/8/chartex" xmlns:cx2="http://schemas.microsoft.com/office/drawing/2015/10/21/chartex" xmlns:cx3="http://schemas.microsoft.com/office/drawing/2016/5/9/chartex" xmlns:cx4="http://schemas.microsoft.com/office/drawing/2016/5/10/chartex" xmlns:cx5="http://schemas.microsoft.com/office/drawing/2016/5/11/chartex" xmlns:cx6="http://schemas.microsoft.com/office/drawing/2016/5/12/chartex" xmlns:cx7="http://schemas.microsoft.com/office/drawing/2016/5/13/chartex" xmlns:cx8="http://schemas.microsoft.com/office/drawing/2016/5/14/chartex" xmlns:mc="http://schemas.openxmlformats.org/markup-compatibility/2006" xmlns:m="http://schemas.openxmlformats.org/officeDocument/2006/math" xmlns:aink="http://schemas.microsoft.com/office/drawing/2016/ink" xmlns:am3d="http://schemas.microsoft.com/office/drawing/2017/model3d" xmlns:oel="http://schemas.microsoft.com/office/2019/extlst" xmlns:r="http://schemas.openxmlformats.org/officeDocument/2006/relationships" xmlns:wp14="http://schemas.microsoft.com/office/word/2010/wordprocessingDrawing" xmlns:wp="http://schemas.openxmlformats.org/drawingml/2006/wordprocessingDrawing" xmlns:wpg="http://schemas.microsoft.com/office/word/2010/wordprocessingGroup" xmlns:wpi="http://schemas.microsoft.com/office/word/2010/wordprocessingInk" xmlns:wps="http://schemas.microsoft.com/office/word/2010/wordprocessingShape" xmlns:o="urn:schemas-microsoft-com:office:office" xmlns:v="urn:schemas-microsoft-com:vml" xmlns:w10="urn:schemas-microsoft-com:office:word" xmlns:w="http://schemas.openxmlformats.org/wordprocessingml/2006/main" xmlns:w14="http://schemas.microsoft.com/office/word/2010/wordml" xmlns:w15="http://schemas.microsoft.com/office/word/2012/wordml" xmlns:w16cex="http://schemas.microsoft.com/office/word/2018/wordml/cex" xmlns:w16cid="http://schemas.microsoft.com/office/word/2016/wordml/cid" xmlns:w16="http://schemas.microsoft.com/office/word/2018/wordml" xmlns:w16sdtdh="http://schemas.microsoft.com/office/word/2020/wordml/sdtdatahash" xmlns:w16sdtfl="http://schemas.microsoft.com/office/word/2024/wordml/sdtformatlock" xmlns:w16se="http://schemas.microsoft.com/office/word/2015/wordml/symex" xmlns:w16du="http://schemas.microsoft.com/office/word/2023/wordml/word16du" xmlns:wne="http://schemas.microsoft.com/office/word/2006/wordml" mc:Ignorable="w14 w15 w16se w16cid w16 w16cex w16sdtdh w16sdtfl w16du wp14">
   <w:body>
     <w:p>
       <w:pPr>
@@ -599,11 +599,12 @@
           <w:lang w:val="en-US"/>
         </w:rPr>
       </w:pPr>
-      <w:r>
-        <w:rPr>
-          <w:lang w:val="en-US"/>
-        </w:rPr>
-        <w:t>In the</w:t>
+      <w:proofErr w:type="gramStart"/>
+      <w:r>
+        <w:rPr>
+          <w:lang w:val="en-US"/>
+        </w:rPr>
+        <w:t xml:space="preserve">In </w:t>
       </w:r>
       <w:r>
         <w:rPr>
@@ -611,44 +612,72 @@
         </w:rPr>
         <w:t xml:space="preserve"> </w:t>
       </w:r>
+      <w:r>
+        <w:rPr>
+          <w:rFonts w:ascii="Consolas" w:hAnsi="Consolas" w:cs="Consolas"/>
+          <w:lang w:val="en-US"/>
+        </w:rPr>
+        <w:t>Program</w:t>
+      </w:r>
+      <w:proofErr w:type="gramEnd"/>
+      <w:r>
+        <w:rPr>
+          <w:lang w:val="en-US"/>
+        </w:rPr>
+        <w:t xml:space="preserve"> </w:t>
+      </w:r>
+      <w:r>
+        <w:rPr>
+          <w:lang w:val="en-US"/>
+        </w:rPr>
+        <w:t xml:space="preserve">use </w:t>
+      </w:r>
+      <w:r>
+        <w:rPr>
+          <w:lang w:val="en-US"/>
+        </w:rPr>
+        <w:t>an</w:t>
+      </w:r>
+      <w:r>
+        <w:rPr>
+          <w:lang w:val="en-US"/>
+        </w:rPr>
+        <w:t xml:space="preserve"> </w:t>
+      </w:r>
+      <w:proofErr w:type="gramStart"/>
+      <w:r>
+        <w:rPr>
+          <w:lang w:val="en-US"/>
+        </w:rPr>
+        <w:t>instance</w:t>
+      </w:r>
+      <w:r>
+        <w:rPr>
+          <w:lang w:val="en-US"/>
+        </w:rPr>
+        <w:t>s</w:t>
+      </w:r>
+      <w:proofErr w:type="gramEnd"/>
+      <w:r>
+        <w:rPr>
+          <w:lang w:val="en-US"/>
+        </w:rPr>
+        <w:t xml:space="preserve"> of </w:t>
+      </w:r>
       <w:proofErr w:type="spellStart"/>
       <w:r>
         <w:rPr>
           <w:rFonts w:ascii="Consolas" w:hAnsi="Consolas" w:cs="Consolas"/>
           <w:lang w:val="en-US"/>
         </w:rPr>
-        <w:t>HospitalBedApplication</w:t>
+        <w:t>BedControl</w:t>
       </w:r>
       <w:proofErr w:type="spellEnd"/>
       <w:r>
         <w:rPr>
           <w:lang w:val="en-US"/>
         </w:rPr>
-        <w:t xml:space="preserve"> </w:t>
-      </w:r>
-      <w:r>
-        <w:rPr>
-          <w:lang w:val="en-US"/>
-        </w:rPr>
-        <w:t>use the</w:t>
-      </w:r>
-      <w:r>
-        <w:rPr>
-          <w:lang w:val="en-US"/>
-        </w:rPr>
-        <w:t xml:space="preserve"> instance</w:t>
-      </w:r>
-      <w:r>
-        <w:rPr>
-          <w:lang w:val="en-US"/>
-        </w:rPr>
-        <w:t>s</w:t>
-      </w:r>
-      <w:r>
-        <w:rPr>
-          <w:lang w:val="en-US"/>
-        </w:rPr>
-        <w:t xml:space="preserve"> of </w:t>
+        <w:t xml:space="preserve"> and </w:t>
       </w:r>
       <w:proofErr w:type="spellStart"/>
       <w:r>
@@ -656,14 +685,14 @@
           <w:rFonts w:ascii="Consolas" w:hAnsi="Consolas" w:cs="Consolas"/>
           <w:lang w:val="en-US"/>
         </w:rPr>
-        <w:t>BedControl</w:t>
+        <w:t>PresenceSensor</w:t>
       </w:r>
       <w:proofErr w:type="spellEnd"/>
       <w:r>
         <w:rPr>
           <w:lang w:val="en-US"/>
         </w:rPr>
-        <w:t xml:space="preserve"> and </w:t>
+        <w:t xml:space="preserve"> – call the </w:t>
       </w:r>
       <w:proofErr w:type="spellStart"/>
       <w:r>
@@ -671,28 +700,13 @@
           <w:rFonts w:ascii="Consolas" w:hAnsi="Consolas" w:cs="Consolas"/>
           <w:lang w:val="en-US"/>
         </w:rPr>
-        <w:t>PresenceSensor</w:t>
+        <w:t>ReadSample</w:t>
       </w:r>
       <w:proofErr w:type="spellEnd"/>
       <w:r>
         <w:rPr>
           <w:lang w:val="en-US"/>
         </w:rPr>
-        <w:t xml:space="preserve"> – call the </w:t>
-      </w:r>
-      <w:proofErr w:type="spellStart"/>
-      <w:r>
-        <w:rPr>
-          <w:rFonts w:ascii="Consolas" w:hAnsi="Consolas" w:cs="Consolas"/>
-          <w:lang w:val="en-US"/>
-        </w:rPr>
-        <w:t>ReadSample</w:t>
-      </w:r>
-      <w:proofErr w:type="spellEnd"/>
-      <w:r>
-        <w:rPr>
-          <w:lang w:val="en-US"/>
-        </w:rPr>
         <w:t xml:space="preserve"> method to test the applicatio</w:t>
       </w:r>
       <w:r>
@@ -711,6 +725,12 @@
         <w:rPr>
           <w:lang w:val="en-US"/>
         </w:rPr>
+        <w:t xml:space="preserve">while </w:t>
+      </w:r>
+      <w:r>
+        <w:rPr>
+          <w:lang w:val="en-US"/>
+        </w:rPr>
         <w:t>loop.</w:t>
       </w:r>
     </w:p>
@@ -737,7 +757,20 @@
         <w:rPr>
           <w:lang w:val="en-US"/>
         </w:rPr>
-        <w:t>, you are going to refactor and extend your solution so that it becomes much more flexible. You are also going to</w:t>
+        <w:t>, you are going to refactor</w:t>
+      </w:r>
+      <w:r>
+        <w:rPr>
+          <w:rStyle w:val="FootnoteReference"/>
+          <w:lang w:val="en-US"/>
+        </w:rPr>
+        <w:footnoteReference w:id="1"/>
+      </w:r>
+      <w:r>
+        <w:rPr>
+          <w:lang w:val="en-US"/>
+        </w:rPr>
+        <w:t xml:space="preserve"> and extend your solution so that it becomes much more flexible. You are also going to</w:t>
       </w:r>
       <w:r>
         <w:rPr>
@@ -1174,6 +1207,7 @@
         <w:rPr>
           <w:lang w:val="en-US"/>
         </w:rPr>
+        <w:lastRenderedPageBreak/>
         <w:t>As an engineer, you know that you sometimes have to filter you</w:t>
       </w:r>
       <w:r>
@@ -1210,14 +1244,7 @@
         <w:rPr>
           <w:lang w:val="en-US"/>
         </w:rPr>
-        <w:t xml:space="preserve"> you come up with a very simple filter: The sensor input must be consistent for 3 consecutive samples before it can be trusted. Update your design to </w:t>
-      </w:r>
-      <w:r>
-        <w:rPr>
-          <w:lang w:val="en-US"/>
-        </w:rPr>
-        <w:lastRenderedPageBreak/>
-        <w:t>include the filter</w:t>
+        <w:t xml:space="preserve"> you come up with a very simple filter: The sensor input must be consistent for 3 consecutive samples before it can be trusted. Update your design to include the filter</w:t>
       </w:r>
       <w:r>
         <w:rPr>
@@ -1569,7 +1596,7 @@
 </file>
 
 <file path=word/endnotes.xml><?xml version="1.0" encoding="utf-8"?>
-<w:endnotes xmlns:wpc="http://schemas.microsoft.com/office/word/2010/wordprocessingCanvas" xmlns:cx="http://schemas.microsoft.com/office/drawing/2014/chartex" xmlns:cx1="http://schemas.microsoft.com/office/drawing/2015/9/8/chartex" xmlns:cx2="http://schemas.microsoft.com/office/drawing/2015/10/21/chartex" xmlns:cx3="http://schemas.microsoft.com/office/drawing/2016/5/9/chartex" xmlns:cx4="http://schemas.microsoft.com/office/drawing/2016/5/10/chartex" xmlns:cx5="http://schemas.microsoft.com/office/drawing/2016/5/11/chartex" xmlns:cx6="http://schemas.microsoft.com/office/drawing/2016/5/12/chartex" xmlns:cx7="http://schemas.microsoft.com/office/drawing/2016/5/13/chartex" xmlns:cx8="http://schemas.microsoft.com/office/drawing/2016/5/14/chartex" xmlns:mc="http://schemas.openxmlformats.org/markup-compatibility/2006" xmlns:aink="http://schemas.microsoft.com/office/drawing/2016/ink" xmlns:am3d="http://schemas.microsoft.com/office/drawing/2017/model3d" xmlns:o="urn:schemas-microsoft-com:office:office" xmlns:oel="http://schemas.microsoft.com/office/2019/extlst" xmlns:r="http://schemas.openxmlformats.org/officeDocument/2006/relationships" xmlns:m="http://schemas.openxmlformats.org/officeDocument/2006/math" xmlns:v="urn:schemas-microsoft-com:vml" xmlns:wp14="http://schemas.microsoft.com/office/word/2010/wordprocessingDrawing" xmlns:wp="http://schemas.openxmlformats.org/drawingml/2006/wordprocessingDrawing" xmlns:w10="urn:schemas-microsoft-com:office:word" xmlns:w="http://schemas.openxmlformats.org/wordprocessingml/2006/main" xmlns:w14="http://schemas.microsoft.com/office/word/2010/wordml" xmlns:w15="http://schemas.microsoft.com/office/word/2012/wordml" xmlns:w16cex="http://schemas.microsoft.com/office/word/2018/wordml/cex" xmlns:w16cid="http://schemas.microsoft.com/office/word/2016/wordml/cid" xmlns:w16="http://schemas.microsoft.com/office/word/2018/wordml" xmlns:w16du="http://schemas.microsoft.com/office/word/2023/wordml/word16du" xmlns:w16sdtdh="http://schemas.microsoft.com/office/word/2020/wordml/sdtdatahash" xmlns:w16sdtfl="http://schemas.microsoft.com/office/word/2024/wordml/sdtformatlock" xmlns:w16se="http://schemas.microsoft.com/office/word/2015/wordml/symex" xmlns:wpg="http://schemas.microsoft.com/office/word/2010/wordprocessingGroup" xmlns:wpi="http://schemas.microsoft.com/office/word/2010/wordprocessingInk" xmlns:wne="http://schemas.microsoft.com/office/word/2006/wordml" xmlns:wps="http://schemas.microsoft.com/office/word/2010/wordprocessingShape" mc:Ignorable="w14 w15 w16se w16cid w16 w16cex w16sdtdh w16sdtfl w16du wp14">
+<w:endnotes xmlns:wpc="http://schemas.microsoft.com/office/word/2010/wordprocessingCanvas" xmlns:cx="http://schemas.microsoft.com/office/drawing/2014/chartex" xmlns:cx1="http://schemas.microsoft.com/office/drawing/2015/9/8/chartex" xmlns:cx2="http://schemas.microsoft.com/office/drawing/2015/10/21/chartex" xmlns:cx3="http://schemas.microsoft.com/office/drawing/2016/5/9/chartex" xmlns:cx4="http://schemas.microsoft.com/office/drawing/2016/5/10/chartex" xmlns:cx5="http://schemas.microsoft.com/office/drawing/2016/5/11/chartex" xmlns:cx6="http://schemas.microsoft.com/office/drawing/2016/5/12/chartex" xmlns:cx7="http://schemas.microsoft.com/office/drawing/2016/5/13/chartex" xmlns:cx8="http://schemas.microsoft.com/office/drawing/2016/5/14/chartex" xmlns:mc="http://schemas.openxmlformats.org/markup-compatibility/2006" xmlns:m="http://schemas.openxmlformats.org/officeDocument/2006/math" xmlns:aink="http://schemas.microsoft.com/office/drawing/2016/ink" xmlns:am3d="http://schemas.microsoft.com/office/drawing/2017/model3d" xmlns:oel="http://schemas.microsoft.com/office/2019/extlst" xmlns:r="http://schemas.openxmlformats.org/officeDocument/2006/relationships" xmlns:wp14="http://schemas.microsoft.com/office/word/2010/wordprocessingDrawing" xmlns:wp="http://schemas.openxmlformats.org/drawingml/2006/wordprocessingDrawing" xmlns:wpg="http://schemas.microsoft.com/office/word/2010/wordprocessingGroup" xmlns:wpi="http://schemas.microsoft.com/office/word/2010/wordprocessingInk" xmlns:wps="http://schemas.microsoft.com/office/word/2010/wordprocessingShape" xmlns:o="urn:schemas-microsoft-com:office:office" xmlns:v="urn:schemas-microsoft-com:vml" xmlns:w10="urn:schemas-microsoft-com:office:word" xmlns:w="http://schemas.openxmlformats.org/wordprocessingml/2006/main" xmlns:w14="http://schemas.microsoft.com/office/word/2010/wordml" xmlns:w15="http://schemas.microsoft.com/office/word/2012/wordml" xmlns:w16cex="http://schemas.microsoft.com/office/word/2018/wordml/cex" xmlns:w16cid="http://schemas.microsoft.com/office/word/2016/wordml/cid" xmlns:w16="http://schemas.microsoft.com/office/word/2018/wordml" xmlns:w16sdtdh="http://schemas.microsoft.com/office/word/2020/wordml/sdtdatahash" xmlns:w16sdtfl="http://schemas.microsoft.com/office/word/2024/wordml/sdtformatlock" xmlns:w16se="http://schemas.microsoft.com/office/word/2015/wordml/symex" xmlns:w16du="http://schemas.microsoft.com/office/word/2023/wordml/word16du" xmlns:wne="http://schemas.microsoft.com/office/word/2006/wordml" mc:Ignorable="w14 w15 w16se w16cid w16 w16cex w16sdtdh w16sdtfl w16du wp14">
   <w:endnote w:type="separator" w:id="-1">
     <w:p>
       <w:r>
@@ -1588,7 +1615,7 @@
 </file>
 
 <file path=word/footer1.xml><?xml version="1.0" encoding="utf-8"?>
-<w:ftr xmlns:wpc="http://schemas.microsoft.com/office/word/2010/wordprocessingCanvas" xmlns:cx="http://schemas.microsoft.com/office/drawing/2014/chartex" xmlns:cx1="http://schemas.microsoft.com/office/drawing/2015/9/8/chartex" xmlns:cx2="http://schemas.microsoft.com/office/drawing/2015/10/21/chartex" xmlns:cx3="http://schemas.microsoft.com/office/drawing/2016/5/9/chartex" xmlns:cx4="http://schemas.microsoft.com/office/drawing/2016/5/10/chartex" xmlns:cx5="http://schemas.microsoft.com/office/drawing/2016/5/11/chartex" xmlns:cx6="http://schemas.microsoft.com/office/drawing/2016/5/12/chartex" xmlns:cx7="http://schemas.microsoft.com/office/drawing/2016/5/13/chartex" xmlns:cx8="http://schemas.microsoft.com/office/drawing/2016/5/14/chartex" xmlns:mc="http://schemas.openxmlformats.org/markup-compatibility/2006" xmlns:aink="http://schemas.microsoft.com/office/drawing/2016/ink" xmlns:am3d="http://schemas.microsoft.com/office/drawing/2017/model3d" xmlns:o="urn:schemas-microsoft-com:office:office" xmlns:oel="http://schemas.microsoft.com/office/2019/extlst" xmlns:r="http://schemas.openxmlformats.org/officeDocument/2006/relationships" xmlns:m="http://schemas.openxmlformats.org/officeDocument/2006/math" xmlns:v="urn:schemas-microsoft-com:vml" xmlns:wp14="http://schemas.microsoft.com/office/word/2010/wordprocessingDrawing" xmlns:wp="http://schemas.openxmlformats.org/drawingml/2006/wordprocessingDrawing" xmlns:w10="urn:schemas-microsoft-com:office:word" xmlns:w="http://schemas.openxmlformats.org/wordprocessingml/2006/main" xmlns:w14="http://schemas.microsoft.com/office/word/2010/wordml" xmlns:w15="http://schemas.microsoft.com/office/word/2012/wordml" xmlns:w16cex="http://schemas.microsoft.com/office/word/2018/wordml/cex" xmlns:w16cid="http://schemas.microsoft.com/office/word/2016/wordml/cid" xmlns:w16="http://schemas.microsoft.com/office/word/2018/wordml" xmlns:w16du="http://schemas.microsoft.com/office/word/2023/wordml/word16du" xmlns:w16sdtdh="http://schemas.microsoft.com/office/word/2020/wordml/sdtdatahash" xmlns:w16sdtfl="http://schemas.microsoft.com/office/word/2024/wordml/sdtformatlock" xmlns:w16se="http://schemas.microsoft.com/office/word/2015/wordml/symex" xmlns:wpg="http://schemas.microsoft.com/office/word/2010/wordprocessingGroup" xmlns:wpi="http://schemas.microsoft.com/office/word/2010/wordprocessingInk" xmlns:wne="http://schemas.microsoft.com/office/word/2006/wordml" xmlns:wps="http://schemas.microsoft.com/office/word/2010/wordprocessingShape" mc:Ignorable="w14 w15 w16se w16cid w16 w16cex w16sdtdh w16sdtfl w16du wp14">
+<w:ftr xmlns:wpc="http://schemas.microsoft.com/office/word/2010/wordprocessingCanvas" xmlns:cx="http://schemas.microsoft.com/office/drawing/2014/chartex" xmlns:cx1="http://schemas.microsoft.com/office/drawing/2015/9/8/chartex" xmlns:cx2="http://schemas.microsoft.com/office/drawing/2015/10/21/chartex" xmlns:cx3="http://schemas.microsoft.com/office/drawing/2016/5/9/chartex" xmlns:cx4="http://schemas.microsoft.com/office/drawing/2016/5/10/chartex" xmlns:cx5="http://schemas.microsoft.com/office/drawing/2016/5/11/chartex" xmlns:cx6="http://schemas.microsoft.com/office/drawing/2016/5/12/chartex" xmlns:cx7="http://schemas.microsoft.com/office/drawing/2016/5/13/chartex" xmlns:cx8="http://schemas.microsoft.com/office/drawing/2016/5/14/chartex" xmlns:mc="http://schemas.openxmlformats.org/markup-compatibility/2006" xmlns:m="http://schemas.openxmlformats.org/officeDocument/2006/math" xmlns:aink="http://schemas.microsoft.com/office/drawing/2016/ink" xmlns:am3d="http://schemas.microsoft.com/office/drawing/2017/model3d" xmlns:oel="http://schemas.microsoft.com/office/2019/extlst" xmlns:r="http://schemas.openxmlformats.org/officeDocument/2006/relationships" xmlns:wp14="http://schemas.microsoft.com/office/word/2010/wordprocessingDrawing" xmlns:wp="http://schemas.openxmlformats.org/drawingml/2006/wordprocessingDrawing" xmlns:wpg="http://schemas.microsoft.com/office/word/2010/wordprocessingGroup" xmlns:wpi="http://schemas.microsoft.com/office/word/2010/wordprocessingInk" xmlns:wps="http://schemas.microsoft.com/office/word/2010/wordprocessingShape" xmlns:o="urn:schemas-microsoft-com:office:office" xmlns:v="urn:schemas-microsoft-com:vml" xmlns:w10="urn:schemas-microsoft-com:office:word" xmlns:w="http://schemas.openxmlformats.org/wordprocessingml/2006/main" xmlns:w14="http://schemas.microsoft.com/office/word/2010/wordml" xmlns:w15="http://schemas.microsoft.com/office/word/2012/wordml" xmlns:w16cex="http://schemas.microsoft.com/office/word/2018/wordml/cex" xmlns:w16cid="http://schemas.microsoft.com/office/word/2016/wordml/cid" xmlns:w16="http://schemas.microsoft.com/office/word/2018/wordml" xmlns:w16sdtdh="http://schemas.microsoft.com/office/word/2020/wordml/sdtdatahash" xmlns:w16sdtfl="http://schemas.microsoft.com/office/word/2024/wordml/sdtformatlock" xmlns:w16se="http://schemas.microsoft.com/office/word/2015/wordml/symex" xmlns:w16du="http://schemas.microsoft.com/office/word/2023/wordml/word16du" xmlns:wne="http://schemas.microsoft.com/office/word/2006/wordml" mc:Ignorable="w14 w15 w16se w16cid w16 w16cex w16sdtdh w16sdtfl w16du wp14">
   <w:sdt>
     <w:sdtPr>
       <w:rPr>
@@ -1754,7 +1781,7 @@
 </file>
 
 <file path=word/footnotes.xml><?xml version="1.0" encoding="utf-8"?>
-<w:footnotes xmlns:wpc="http://schemas.microsoft.com/office/word/2010/wordprocessingCanvas" xmlns:cx="http://schemas.microsoft.com/office/drawing/2014/chartex" xmlns:cx1="http://schemas.microsoft.com/office/drawing/2015/9/8/chartex" xmlns:cx2="http://schemas.microsoft.com/office/drawing/2015/10/21/chartex" xmlns:cx3="http://schemas.microsoft.com/office/drawing/2016/5/9/chartex" xmlns:cx4="http://schemas.microsoft.com/office/drawing/2016/5/10/chartex" xmlns:cx5="http://schemas.microsoft.com/office/drawing/2016/5/11/chartex" xmlns:cx6="http://schemas.microsoft.com/office/drawing/2016/5/12/chartex" xmlns:cx7="http://schemas.microsoft.com/office/drawing/2016/5/13/chartex" xmlns:cx8="http://schemas.microsoft.com/office/drawing/2016/5/14/chartex" xmlns:mc="http://schemas.openxmlformats.org/markup-compatibility/2006" xmlns:aink="http://schemas.microsoft.com/office/drawing/2016/ink" xmlns:am3d="http://schemas.microsoft.com/office/drawing/2017/model3d" xmlns:o="urn:schemas-microsoft-com:office:office" xmlns:oel="http://schemas.microsoft.com/office/2019/extlst" xmlns:r="http://schemas.openxmlformats.org/officeDocument/2006/relationships" xmlns:m="http://schemas.openxmlformats.org/officeDocument/2006/math" xmlns:v="urn:schemas-microsoft-com:vml" xmlns:wp14="http://schemas.microsoft.com/office/word/2010/wordprocessingDrawing" xmlns:wp="http://schemas.openxmlformats.org/drawingml/2006/wordprocessingDrawing" xmlns:w10="urn:schemas-microsoft-com:office:word" xmlns:w="http://schemas.openxmlformats.org/wordprocessingml/2006/main" xmlns:w14="http://schemas.microsoft.com/office/word/2010/wordml" xmlns:w15="http://schemas.microsoft.com/office/word/2012/wordml" xmlns:w16cex="http://schemas.microsoft.com/office/word/2018/wordml/cex" xmlns:w16cid="http://schemas.microsoft.com/office/word/2016/wordml/cid" xmlns:w16="http://schemas.microsoft.com/office/word/2018/wordml" xmlns:w16du="http://schemas.microsoft.com/office/word/2023/wordml/word16du" xmlns:w16sdtdh="http://schemas.microsoft.com/office/word/2020/wordml/sdtdatahash" xmlns:w16sdtfl="http://schemas.microsoft.com/office/word/2024/wordml/sdtformatlock" xmlns:w16se="http://schemas.microsoft.com/office/word/2015/wordml/symex" xmlns:wpg="http://schemas.microsoft.com/office/word/2010/wordprocessingGroup" xmlns:wpi="http://schemas.microsoft.com/office/word/2010/wordprocessingInk" xmlns:wne="http://schemas.microsoft.com/office/word/2006/wordml" xmlns:wps="http://schemas.microsoft.com/office/word/2010/wordprocessingShape" mc:Ignorable="w14 w15 w16se w16cid w16 w16cex w16sdtdh w16sdtfl w16du wp14">
+<w:footnotes xmlns:wpc="http://schemas.microsoft.com/office/word/2010/wordprocessingCanvas" xmlns:cx="http://schemas.microsoft.com/office/drawing/2014/chartex" xmlns:cx1="http://schemas.microsoft.com/office/drawing/2015/9/8/chartex" xmlns:cx2="http://schemas.microsoft.com/office/drawing/2015/10/21/chartex" xmlns:cx3="http://schemas.microsoft.com/office/drawing/2016/5/9/chartex" xmlns:cx4="http://schemas.microsoft.com/office/drawing/2016/5/10/chartex" xmlns:cx5="http://schemas.microsoft.com/office/drawing/2016/5/11/chartex" xmlns:cx6="http://schemas.microsoft.com/office/drawing/2016/5/12/chartex" xmlns:cx7="http://schemas.microsoft.com/office/drawing/2016/5/13/chartex" xmlns:cx8="http://schemas.microsoft.com/office/drawing/2016/5/14/chartex" xmlns:mc="http://schemas.openxmlformats.org/markup-compatibility/2006" xmlns:m="http://schemas.openxmlformats.org/officeDocument/2006/math" xmlns:aink="http://schemas.microsoft.com/office/drawing/2016/ink" xmlns:am3d="http://schemas.microsoft.com/office/drawing/2017/model3d" xmlns:oel="http://schemas.microsoft.com/office/2019/extlst" xmlns:r="http://schemas.openxmlformats.org/officeDocument/2006/relationships" xmlns:wp14="http://schemas.microsoft.com/office/word/2010/wordprocessingDrawing" xmlns:wp="http://schemas.openxmlformats.org/drawingml/2006/wordprocessingDrawing" xmlns:wpg="http://schemas.microsoft.com/office/word/2010/wordprocessingGroup" xmlns:wpi="http://schemas.microsoft.com/office/word/2010/wordprocessingInk" xmlns:wps="http://schemas.microsoft.com/office/word/2010/wordprocessingShape" xmlns:o="urn:schemas-microsoft-com:office:office" xmlns:v="urn:schemas-microsoft-com:vml" xmlns:w10="urn:schemas-microsoft-com:office:word" xmlns:w="http://schemas.openxmlformats.org/wordprocessingml/2006/main" xmlns:w14="http://schemas.microsoft.com/office/word/2010/wordml" xmlns:w15="http://schemas.microsoft.com/office/word/2012/wordml" xmlns:w16cex="http://schemas.microsoft.com/office/word/2018/wordml/cex" xmlns:w16cid="http://schemas.microsoft.com/office/word/2016/wordml/cid" xmlns:w16="http://schemas.microsoft.com/office/word/2018/wordml" xmlns:w16sdtdh="http://schemas.microsoft.com/office/word/2020/wordml/sdtdatahash" xmlns:w16sdtfl="http://schemas.microsoft.com/office/word/2024/wordml/sdtformatlock" xmlns:w16se="http://schemas.microsoft.com/office/word/2015/wordml/symex" xmlns:w16du="http://schemas.microsoft.com/office/word/2023/wordml/word16du" xmlns:wne="http://schemas.microsoft.com/office/word/2006/wordml" mc:Ignorable="w14 w15 w16se w16cid w16 w16cex w16sdtdh w16sdtfl w16du wp14">
   <w:footnote w:type="separator" w:id="-1">
     <w:p>
       <w:r>
@@ -1766,6 +1793,34 @@
     <w:p>
       <w:r>
         <w:continuationSeparator/>
+      </w:r>
+    </w:p>
+  </w:footnote>
+  <w:footnote w:id="1">
+    <w:p>
+      <w:pPr>
+        <w:pStyle w:val="FootnoteText"/>
+        <w:rPr>
+          <w:lang w:val="en-US"/>
+        </w:rPr>
+      </w:pPr>
+      <w:r>
+        <w:rPr>
+          <w:rStyle w:val="FootnoteReference"/>
+        </w:rPr>
+        <w:footnoteRef/>
+      </w:r>
+      <w:r>
+        <w:rPr>
+          <w:lang w:val="en-US"/>
+        </w:rPr>
+        <w:t xml:space="preserve"> </w:t>
+      </w:r>
+      <w:r>
+        <w:rPr>
+          <w:lang w:val="en-US"/>
+        </w:rPr>
+        <w:t>Refactor means changing how the code looks, but without changing how the software works.</w:t>
       </w:r>
     </w:p>
   </w:footnote>
@@ -1773,7 +1828,7 @@
 </file>
 
 <file path=word/header1.xml><?xml version="1.0" encoding="utf-8"?>
-<w:hdr xmlns:wpc="http://schemas.microsoft.com/office/word/2010/wordprocessingCanvas" xmlns:cx="http://schemas.microsoft.com/office/drawing/2014/chartex" xmlns:cx1="http://schemas.microsoft.com/office/drawing/2015/9/8/chartex" xmlns:cx2="http://schemas.microsoft.com/office/drawing/2015/10/21/chartex" xmlns:cx3="http://schemas.microsoft.com/office/drawing/2016/5/9/chartex" xmlns:cx4="http://schemas.microsoft.com/office/drawing/2016/5/10/chartex" xmlns:cx5="http://schemas.microsoft.com/office/drawing/2016/5/11/chartex" xmlns:cx6="http://schemas.microsoft.com/office/drawing/2016/5/12/chartex" xmlns:cx7="http://schemas.microsoft.com/office/drawing/2016/5/13/chartex" xmlns:cx8="http://schemas.microsoft.com/office/drawing/2016/5/14/chartex" xmlns:mc="http://schemas.openxmlformats.org/markup-compatibility/2006" xmlns:aink="http://schemas.microsoft.com/office/drawing/2016/ink" xmlns:am3d="http://schemas.microsoft.com/office/drawing/2017/model3d" xmlns:o="urn:schemas-microsoft-com:office:office" xmlns:oel="http://schemas.microsoft.com/office/2019/extlst" xmlns:r="http://schemas.openxmlformats.org/officeDocument/2006/relationships" xmlns:m="http://schemas.openxmlformats.org/officeDocument/2006/math" xmlns:v="urn:schemas-microsoft-com:vml" xmlns:wp14="http://schemas.microsoft.com/office/word/2010/wordprocessingDrawing" xmlns:wp="http://schemas.openxmlformats.org/drawingml/2006/wordprocessingDrawing" xmlns:w10="urn:schemas-microsoft-com:office:word" xmlns:w="http://schemas.openxmlformats.org/wordprocessingml/2006/main" xmlns:w14="http://schemas.microsoft.com/office/word/2010/wordml" xmlns:w15="http://schemas.microsoft.com/office/word/2012/wordml" xmlns:w16cex="http://schemas.microsoft.com/office/word/2018/wordml/cex" xmlns:w16cid="http://schemas.microsoft.com/office/word/2016/wordml/cid" xmlns:w16="http://schemas.microsoft.com/office/word/2018/wordml" xmlns:w16du="http://schemas.microsoft.com/office/word/2023/wordml/word16du" xmlns:w16sdtdh="http://schemas.microsoft.com/office/word/2020/wordml/sdtdatahash" xmlns:w16sdtfl="http://schemas.microsoft.com/office/word/2024/wordml/sdtformatlock" xmlns:w16se="http://schemas.microsoft.com/office/word/2015/wordml/symex" xmlns:wpg="http://schemas.microsoft.com/office/word/2010/wordprocessingGroup" xmlns:wpi="http://schemas.microsoft.com/office/word/2010/wordprocessingInk" xmlns:wne="http://schemas.microsoft.com/office/word/2006/wordml" xmlns:wps="http://schemas.microsoft.com/office/word/2010/wordprocessingShape" mc:Ignorable="w14 w15 w16se w16cid w16 w16cex w16sdtdh w16sdtfl w16du wp14">
+<w:hdr xmlns:wpc="http://schemas.microsoft.com/office/word/2010/wordprocessingCanvas" xmlns:cx="http://schemas.microsoft.com/office/drawing/2014/chartex" xmlns:cx1="http://schemas.microsoft.com/office/drawing/2015/9/8/chartex" xmlns:cx2="http://schemas.microsoft.com/office/drawing/2015/10/21/chartex" xmlns:cx3="http://schemas.microsoft.com/office/drawing/2016/5/9/chartex" xmlns:cx4="http://schemas.microsoft.com/office/drawing/2016/5/10/chartex" xmlns:cx5="http://schemas.microsoft.com/office/drawing/2016/5/11/chartex" xmlns:cx6="http://schemas.microsoft.com/office/drawing/2016/5/12/chartex" xmlns:cx7="http://schemas.microsoft.com/office/drawing/2016/5/13/chartex" xmlns:cx8="http://schemas.microsoft.com/office/drawing/2016/5/14/chartex" xmlns:mc="http://schemas.openxmlformats.org/markup-compatibility/2006" xmlns:m="http://schemas.openxmlformats.org/officeDocument/2006/math" xmlns:aink="http://schemas.microsoft.com/office/drawing/2016/ink" xmlns:am3d="http://schemas.microsoft.com/office/drawing/2017/model3d" xmlns:oel="http://schemas.microsoft.com/office/2019/extlst" xmlns:r="http://schemas.openxmlformats.org/officeDocument/2006/relationships" xmlns:wp14="http://schemas.microsoft.com/office/word/2010/wordprocessingDrawing" xmlns:wp="http://schemas.openxmlformats.org/drawingml/2006/wordprocessingDrawing" xmlns:wpg="http://schemas.microsoft.com/office/word/2010/wordprocessingGroup" xmlns:wpi="http://schemas.microsoft.com/office/word/2010/wordprocessingInk" xmlns:wps="http://schemas.microsoft.com/office/word/2010/wordprocessingShape" xmlns:o="urn:schemas-microsoft-com:office:office" xmlns:v="urn:schemas-microsoft-com:vml" xmlns:w10="urn:schemas-microsoft-com:office:word" xmlns:w="http://schemas.openxmlformats.org/wordprocessingml/2006/main" xmlns:w14="http://schemas.microsoft.com/office/word/2010/wordml" xmlns:w15="http://schemas.microsoft.com/office/word/2012/wordml" xmlns:w16cex="http://schemas.microsoft.com/office/word/2018/wordml/cex" xmlns:w16cid="http://schemas.microsoft.com/office/word/2016/wordml/cid" xmlns:w16="http://schemas.microsoft.com/office/word/2018/wordml" xmlns:w16sdtdh="http://schemas.microsoft.com/office/word/2020/wordml/sdtdatahash" xmlns:w16sdtfl="http://schemas.microsoft.com/office/word/2024/wordml/sdtformatlock" xmlns:w16se="http://schemas.microsoft.com/office/word/2015/wordml/symex" xmlns:w16du="http://schemas.microsoft.com/office/word/2023/wordml/word16du" xmlns:wne="http://schemas.microsoft.com/office/word/2006/wordml" mc:Ignorable="w14 w15 w16se w16cid w16 w16cex w16sdtdh w16sdtfl w16du wp14">
   <w:p>
     <w:pPr>
       <w:pStyle w:val="Header"/>
@@ -1989,7 +2044,7 @@
 </file>
 
 <file path=word/numbering.xml><?xml version="1.0" encoding="utf-8"?>
-<w:numbering xmlns:wpc="http://schemas.microsoft.com/office/word/2010/wordprocessingCanvas" xmlns:cx="http://schemas.microsoft.com/office/drawing/2014/chartex" xmlns:cx1="http://schemas.microsoft.com/office/drawing/2015/9/8/chartex" xmlns:cx2="http://schemas.microsoft.com/office/drawing/2015/10/21/chartex" xmlns:cx3="http://schemas.microsoft.com/office/drawing/2016/5/9/chartex" xmlns:cx4="http://schemas.microsoft.com/office/drawing/2016/5/10/chartex" xmlns:cx5="http://schemas.microsoft.com/office/drawing/2016/5/11/chartex" xmlns:cx6="http://schemas.microsoft.com/office/drawing/2016/5/12/chartex" xmlns:cx7="http://schemas.microsoft.com/office/drawing/2016/5/13/chartex" xmlns:cx8="http://schemas.microsoft.com/office/drawing/2016/5/14/chartex" xmlns:mc="http://schemas.openxmlformats.org/markup-compatibility/2006" xmlns:aink="http://schemas.microsoft.com/office/drawing/2016/ink" xmlns:am3d="http://schemas.microsoft.com/office/drawing/2017/model3d" xmlns:o="urn:schemas-microsoft-com:office:office" xmlns:oel="http://schemas.microsoft.com/office/2019/extlst" xmlns:r="http://schemas.openxmlformats.org/officeDocument/2006/relationships" xmlns:m="http://schemas.openxmlformats.org/officeDocument/2006/math" xmlns:v="urn:schemas-microsoft-com:vml" xmlns:wp14="http://schemas.microsoft.com/office/word/2010/wordprocessingDrawing" xmlns:wp="http://schemas.openxmlformats.org/drawingml/2006/wordprocessingDrawing" xmlns:w10="urn:schemas-microsoft-com:office:word" xmlns:w="http://schemas.openxmlformats.org/wordprocessingml/2006/main" xmlns:w14="http://schemas.microsoft.com/office/word/2010/wordml" xmlns:w15="http://schemas.microsoft.com/office/word/2012/wordml" xmlns:w16cex="http://schemas.microsoft.com/office/word/2018/wordml/cex" xmlns:w16cid="http://schemas.microsoft.com/office/word/2016/wordml/cid" xmlns:w16="http://schemas.microsoft.com/office/word/2018/wordml" xmlns:w16du="http://schemas.microsoft.com/office/word/2023/wordml/word16du" xmlns:w16sdtdh="http://schemas.microsoft.com/office/word/2020/wordml/sdtdatahash" xmlns:w16sdtfl="http://schemas.microsoft.com/office/word/2024/wordml/sdtformatlock" xmlns:w16se="http://schemas.microsoft.com/office/word/2015/wordml/symex" xmlns:wpg="http://schemas.microsoft.com/office/word/2010/wordprocessingGroup" xmlns:wpi="http://schemas.microsoft.com/office/word/2010/wordprocessingInk" xmlns:wne="http://schemas.microsoft.com/office/word/2006/wordml" xmlns:wps="http://schemas.microsoft.com/office/word/2010/wordprocessingShape" mc:Ignorable="w14 w15 w16se w16cid w16 w16cex w16sdtdh w16sdtfl w16du wp14">
+<w:numbering xmlns:wpc="http://schemas.microsoft.com/office/word/2010/wordprocessingCanvas" xmlns:cx="http://schemas.microsoft.com/office/drawing/2014/chartex" xmlns:cx1="http://schemas.microsoft.com/office/drawing/2015/9/8/chartex" xmlns:cx2="http://schemas.microsoft.com/office/drawing/2015/10/21/chartex" xmlns:cx3="http://schemas.microsoft.com/office/drawing/2016/5/9/chartex" xmlns:cx4="http://schemas.microsoft.com/office/drawing/2016/5/10/chartex" xmlns:cx5="http://schemas.microsoft.com/office/drawing/2016/5/11/chartex" xmlns:cx6="http://schemas.microsoft.com/office/drawing/2016/5/12/chartex" xmlns:cx7="http://schemas.microsoft.com/office/drawing/2016/5/13/chartex" xmlns:cx8="http://schemas.microsoft.com/office/drawing/2016/5/14/chartex" xmlns:mc="http://schemas.openxmlformats.org/markup-compatibility/2006" xmlns:m="http://schemas.openxmlformats.org/officeDocument/2006/math" xmlns:aink="http://schemas.microsoft.com/office/drawing/2016/ink" xmlns:am3d="http://schemas.microsoft.com/office/drawing/2017/model3d" xmlns:oel="http://schemas.microsoft.com/office/2019/extlst" xmlns:r="http://schemas.openxmlformats.org/officeDocument/2006/relationships" xmlns:wp14="http://schemas.microsoft.com/office/word/2010/wordprocessingDrawing" xmlns:wp="http://schemas.openxmlformats.org/drawingml/2006/wordprocessingDrawing" xmlns:wpg="http://schemas.microsoft.com/office/word/2010/wordprocessingGroup" xmlns:wpi="http://schemas.microsoft.com/office/word/2010/wordprocessingInk" xmlns:wps="http://schemas.microsoft.com/office/word/2010/wordprocessingShape" xmlns:o="urn:schemas-microsoft-com:office:office" xmlns:v="urn:schemas-microsoft-com:vml" xmlns:w10="urn:schemas-microsoft-com:office:word" xmlns:w="http://schemas.openxmlformats.org/wordprocessingml/2006/main" xmlns:w14="http://schemas.microsoft.com/office/word/2010/wordml" xmlns:w15="http://schemas.microsoft.com/office/word/2012/wordml" xmlns:w16cex="http://schemas.microsoft.com/office/word/2018/wordml/cex" xmlns:w16cid="http://schemas.microsoft.com/office/word/2016/wordml/cid" xmlns:w16="http://schemas.microsoft.com/office/word/2018/wordml" xmlns:w16sdtdh="http://schemas.microsoft.com/office/word/2020/wordml/sdtdatahash" xmlns:w16sdtfl="http://schemas.microsoft.com/office/word/2024/wordml/sdtformatlock" xmlns:w16se="http://schemas.microsoft.com/office/word/2015/wordml/symex" xmlns:w16du="http://schemas.microsoft.com/office/word/2023/wordml/word16du" xmlns:wne="http://schemas.microsoft.com/office/word/2006/wordml" mc:Ignorable="w14 w15 w16se w16cid w16 w16cex w16sdtdh w16sdtfl w16du wp14">
   <w:abstractNum w:abstractNumId="0" w15:restartNumberingAfterBreak="0">
     <w:nsid w:val="2DFB2120"/>
     <w:multiLevelType w:val="hybridMultilevel"/>
@@ -2931,7 +2986,7 @@
 </file>
 
 <file path=word/people.xml><?xml version="1.0" encoding="utf-8"?>
-<w15:people xmlns:wpc="http://schemas.microsoft.com/office/word/2010/wordprocessingCanvas" xmlns:cx="http://schemas.microsoft.com/office/drawing/2014/chartex" xmlns:cx1="http://schemas.microsoft.com/office/drawing/2015/9/8/chartex" xmlns:cx2="http://schemas.microsoft.com/office/drawing/2015/10/21/chartex" xmlns:cx3="http://schemas.microsoft.com/office/drawing/2016/5/9/chartex" xmlns:cx4="http://schemas.microsoft.com/office/drawing/2016/5/10/chartex" xmlns:cx5="http://schemas.microsoft.com/office/drawing/2016/5/11/chartex" xmlns:cx6="http://schemas.microsoft.com/office/drawing/2016/5/12/chartex" xmlns:cx7="http://schemas.microsoft.com/office/drawing/2016/5/13/chartex" xmlns:cx8="http://schemas.microsoft.com/office/drawing/2016/5/14/chartex" xmlns:mc="http://schemas.openxmlformats.org/markup-compatibility/2006" xmlns:aink="http://schemas.microsoft.com/office/drawing/2016/ink" xmlns:am3d="http://schemas.microsoft.com/office/drawing/2017/model3d" xmlns:o="urn:schemas-microsoft-com:office:office" xmlns:oel="http://schemas.microsoft.com/office/2019/extlst" xmlns:r="http://schemas.openxmlformats.org/officeDocument/2006/relationships" xmlns:m="http://schemas.openxmlformats.org/officeDocument/2006/math" xmlns:v="urn:schemas-microsoft-com:vml" xmlns:wp14="http://schemas.microsoft.com/office/word/2010/wordprocessingDrawing" xmlns:wp="http://schemas.openxmlformats.org/drawingml/2006/wordprocessingDrawing" xmlns:w10="urn:schemas-microsoft-com:office:word" xmlns:w="http://schemas.openxmlformats.org/wordprocessingml/2006/main" xmlns:w14="http://schemas.microsoft.com/office/word/2010/wordml" xmlns:w15="http://schemas.microsoft.com/office/word/2012/wordml" xmlns:w16cex="http://schemas.microsoft.com/office/word/2018/wordml/cex" xmlns:w16cid="http://schemas.microsoft.com/office/word/2016/wordml/cid" xmlns:w16="http://schemas.microsoft.com/office/word/2018/wordml" xmlns:w16du="http://schemas.microsoft.com/office/word/2023/wordml/word16du" xmlns:w16sdtdh="http://schemas.microsoft.com/office/word/2020/wordml/sdtdatahash" xmlns:w16sdtfl="http://schemas.microsoft.com/office/word/2024/wordml/sdtformatlock" xmlns:w16se="http://schemas.microsoft.com/office/word/2015/wordml/symex" xmlns:wpg="http://schemas.microsoft.com/office/word/2010/wordprocessingGroup" xmlns:wpi="http://schemas.microsoft.com/office/word/2010/wordprocessingInk" xmlns:wne="http://schemas.microsoft.com/office/word/2006/wordml" xmlns:wps="http://schemas.microsoft.com/office/word/2010/wordprocessingShape" mc:Ignorable="w14 w15 w16se w16cid w16 w16cex w16sdtdh w16sdtfl w16du wp14">
+<w15:people xmlns:wpc="http://schemas.microsoft.com/office/word/2010/wordprocessingCanvas" xmlns:cx="http://schemas.microsoft.com/office/drawing/2014/chartex" xmlns:cx1="http://schemas.microsoft.com/office/drawing/2015/9/8/chartex" xmlns:cx2="http://schemas.microsoft.com/office/drawing/2015/10/21/chartex" xmlns:cx3="http://schemas.microsoft.com/office/drawing/2016/5/9/chartex" xmlns:cx4="http://schemas.microsoft.com/office/drawing/2016/5/10/chartex" xmlns:cx5="http://schemas.microsoft.com/office/drawing/2016/5/11/chartex" xmlns:cx6="http://schemas.microsoft.com/office/drawing/2016/5/12/chartex" xmlns:cx7="http://schemas.microsoft.com/office/drawing/2016/5/13/chartex" xmlns:cx8="http://schemas.microsoft.com/office/drawing/2016/5/14/chartex" xmlns:mc="http://schemas.openxmlformats.org/markup-compatibility/2006" xmlns:m="http://schemas.openxmlformats.org/officeDocument/2006/math" xmlns:aink="http://schemas.microsoft.com/office/drawing/2016/ink" xmlns:am3d="http://schemas.microsoft.com/office/drawing/2017/model3d" xmlns:oel="http://schemas.microsoft.com/office/2019/extlst" xmlns:r="http://schemas.openxmlformats.org/officeDocument/2006/relationships" xmlns:wp14="http://schemas.microsoft.com/office/word/2010/wordprocessingDrawing" xmlns:wp="http://schemas.openxmlformats.org/drawingml/2006/wordprocessingDrawing" xmlns:wpg="http://schemas.microsoft.com/office/word/2010/wordprocessingGroup" xmlns:wpi="http://schemas.microsoft.com/office/word/2010/wordprocessingInk" xmlns:wps="http://schemas.microsoft.com/office/word/2010/wordprocessingShape" xmlns:o="urn:schemas-microsoft-com:office:office" xmlns:v="urn:schemas-microsoft-com:vml" xmlns:w10="urn:schemas-microsoft-com:office:word" xmlns:w="http://schemas.openxmlformats.org/wordprocessingml/2006/main" xmlns:w14="http://schemas.microsoft.com/office/word/2010/wordml" xmlns:w15="http://schemas.microsoft.com/office/word/2012/wordml" xmlns:w16cex="http://schemas.microsoft.com/office/word/2018/wordml/cex" xmlns:w16cid="http://schemas.microsoft.com/office/word/2016/wordml/cid" xmlns:w16="http://schemas.microsoft.com/office/word/2018/wordml" xmlns:w16sdtdh="http://schemas.microsoft.com/office/word/2020/wordml/sdtdatahash" xmlns:w16sdtfl="http://schemas.microsoft.com/office/word/2024/wordml/sdtformatlock" xmlns:w16se="http://schemas.microsoft.com/office/word/2015/wordml/symex" xmlns:w16du="http://schemas.microsoft.com/office/word/2023/wordml/word16du" xmlns:wne="http://schemas.microsoft.com/office/word/2006/wordml" mc:Ignorable="w14 w15 w16se w16cid w16 w16cex w16sdtdh w16sdtfl w16du wp14">
   <w15:person w15:author="Michael Sørensen Loft">
     <w15:presenceInfo w15:providerId="None" w15:userId="Michael Sørensen Loft"/>
   </w15:person>
@@ -2939,7 +2994,7 @@
 </file>
 
 <file path=word/styles.xml><?xml version="1.0" encoding="utf-8"?>
-<w:styles xmlns:mc="http://schemas.openxmlformats.org/markup-compatibility/2006" xmlns:r="http://schemas.openxmlformats.org/officeDocument/2006/relationships" xmlns:w="http://schemas.openxmlformats.org/wordprocessingml/2006/main" xmlns:w14="http://schemas.microsoft.com/office/word/2010/wordml" xmlns:w15="http://schemas.microsoft.com/office/word/2012/wordml" xmlns:w16cex="http://schemas.microsoft.com/office/word/2018/wordml/cex" xmlns:w16cid="http://schemas.microsoft.com/office/word/2016/wordml/cid" xmlns:w16="http://schemas.microsoft.com/office/word/2018/wordml" xmlns:w16du="http://schemas.microsoft.com/office/word/2023/wordml/word16du" xmlns:w16sdtdh="http://schemas.microsoft.com/office/word/2020/wordml/sdtdatahash" xmlns:w16sdtfl="http://schemas.microsoft.com/office/word/2024/wordml/sdtformatlock" xmlns:w16se="http://schemas.microsoft.com/office/word/2015/wordml/symex" mc:Ignorable="w14 w15 w16se w16cid w16 w16cex w16sdtdh w16sdtfl w16du">
+<w:styles xmlns:mc="http://schemas.openxmlformats.org/markup-compatibility/2006" xmlns:r="http://schemas.openxmlformats.org/officeDocument/2006/relationships" xmlns:w="http://schemas.openxmlformats.org/wordprocessingml/2006/main" xmlns:w14="http://schemas.microsoft.com/office/word/2010/wordml" xmlns:w15="http://schemas.microsoft.com/office/word/2012/wordml" xmlns:w16cex="http://schemas.microsoft.com/office/word/2018/wordml/cex" xmlns:w16cid="http://schemas.microsoft.com/office/word/2016/wordml/cid" xmlns:w16="http://schemas.microsoft.com/office/word/2018/wordml" xmlns:w16sdtdh="http://schemas.microsoft.com/office/word/2020/wordml/sdtdatahash" xmlns:w16sdtfl="http://schemas.microsoft.com/office/word/2024/wordml/sdtformatlock" xmlns:w16se="http://schemas.microsoft.com/office/word/2015/wordml/symex" xmlns:w16du="http://schemas.microsoft.com/office/word/2023/wordml/word16du" mc:Ignorable="w14 w15 w16se w16cid w16 w16cex w16sdtdh w16sdtfl w16du">
   <w:docDefaults>
     <w:rPrDefault>
       <w:rPr>
@@ -3811,6 +3866,41 @@
       <w:sz w:val="20"/>
     </w:rPr>
   </w:style>
+  <w:style w:type="paragraph" w:styleId="FootnoteText">
+    <w:name w:val="footnote text"/>
+    <w:basedOn w:val="Normal"/>
+    <w:link w:val="FootnoteTextChar"/>
+    <w:uiPriority w:val="99"/>
+    <w:semiHidden/>
+    <w:unhideWhenUsed/>
+    <w:rsid w:val="00706971"/>
+    <w:rPr>
+      <w:szCs w:val="20"/>
+    </w:rPr>
+  </w:style>
+  <w:style w:type="character" w:customStyle="1" w:styleId="FootnoteTextChar">
+    <w:name w:val="Footnote Text Char"/>
+    <w:basedOn w:val="DefaultParagraphFont"/>
+    <w:link w:val="FootnoteText"/>
+    <w:uiPriority w:val="99"/>
+    <w:semiHidden/>
+    <w:rsid w:val="00706971"/>
+    <w:rPr>
+      <w:sz w:val="20"/>
+      <w:szCs w:val="20"/>
+    </w:rPr>
+  </w:style>
+  <w:style w:type="character" w:styleId="FootnoteReference">
+    <w:name w:val="footnote reference"/>
+    <w:basedOn w:val="DefaultParagraphFont"/>
+    <w:uiPriority w:val="99"/>
+    <w:semiHidden/>
+    <w:unhideWhenUsed/>
+    <w:rsid w:val="00706971"/>
+    <w:rPr>
+      <w:vertAlign w:val="superscript"/>
+    </w:rPr>
+  </w:style>
 </w:styles>
 </file>
 

</xml_diff>